<commit_message>
Replace the drawn diagrams in the simple report with UML (component, sequence, activity) from PlantUML text
Co-Authored-By: Claude Sonnet 5.5 <noreply@anthropic.com>
Claude-Session: https://claude.ai/code/session_01MQYFZmhPpkuRcvYaNsSqiH
</commit_message>
<xml_diff>
--- a/report/HF_Model_Finder_Report_Simple.docx
+++ b/report/HF_Model_Finder_Report_Simple.docx
@@ -669,7 +669,7 @@
           <w:sz w:val="24"/>
         </w:rPr>
         <w:tab/>
-        <w:t>5</w:t>
+        <w:t>6</w:t>
       </w:r>
     </w:p>
     <w:p>
@@ -729,7 +729,7 @@
           <w:sz w:val="24"/>
         </w:rPr>
         <w:tab/>
-        <w:t>8</w:t>
+        <w:t>9</w:t>
       </w:r>
     </w:p>
     <w:p>
@@ -780,7 +780,7 @@
           <w:b/>
           <w:sz w:val="24"/>
         </w:rPr>
-        <w:t>Appendix A: Flowcharts</w:t>
+        <w:t>Appendix A: UML Activity Diagrams</w:t>
       </w:r>
       <w:r>
         <w:rPr>
@@ -3453,7 +3453,7 @@
           <w:b/>
           <w:sz w:val="25"/>
         </w:rPr>
-        <w:t>3.2  Block diagram</w:t>
+        <w:t>3.2  Component diagram</w:t>
       </w:r>
     </w:p>
     <w:p>
@@ -3480,7 +3480,7 @@
           <w:i w:val="0"/>
           <w:sz w:val="22"/>
         </w:rPr>
-        <w:t xml:space="preserve"> shows the two halves of the system. The </w:t>
+        <w:t xml:space="preserve"> is a UML component diagram of the system. The </w:t>
       </w:r>
       <w:r>
         <w:rPr>
@@ -3498,7 +3498,7 @@
           <w:i w:val="0"/>
           <w:sz w:val="22"/>
         </w:rPr>
-        <w:t xml:space="preserve"> half runs once: it downloads model information from Hugging Face, cleans it, and stores it in a searchable index. The </w:t>
+        <w:t xml:space="preserve"> part runs once: it downloads model information from Hugging Face, cleans it, keeps the facts in a snapshot, and stores the page text as vectors in the Pinecone index. The </w:t>
       </w:r>
       <w:r>
         <w:rPr>
@@ -3516,7 +3516,7 @@
           <w:i w:val="0"/>
           <w:sz w:val="22"/>
         </w:rPr>
-        <w:t xml:space="preserve"> half runs for every question: it reads the request, searches the index, checks the rules in code, and shows the best five models with a short explanation. The two halves meet only at the index.</w:t>
+        <w:t xml:space="preserve"> part runs for every question: the web page sends the request to the query pipeline, which uses the language model, searches the index, and asks the verifier to check the rules using the snapshot. The two parts meet only at the data stores.</w:t>
       </w:r>
     </w:p>
     <w:p>
@@ -3530,7 +3530,7 @@
       <w:r>
         <w:drawing>
           <wp:inline xmlns:a="http://schemas.openxmlformats.org/drawingml/2006/main" xmlns:pic="http://schemas.openxmlformats.org/drawingml/2006/picture">
-            <wp:extent cx="4140000" cy="3073636"/>
+            <wp:extent cx="4680000" cy="4247421"/>
             <wp:docPr id="2" name="Picture 2"/>
             <wp:cNvGraphicFramePr>
               <a:graphicFrameLocks noChangeAspect="1"/>
@@ -3539,7 +3539,7 @@
               <a:graphicData uri="http://schemas.openxmlformats.org/drawingml/2006/picture">
                 <pic:pic>
                   <pic:nvPicPr>
-                    <pic:cNvPr id="0" name="fig_block.png"/>
+                    <pic:cNvPr id="0" name="uml_component.png"/>
                     <pic:cNvPicPr/>
                   </pic:nvPicPr>
                   <pic:blipFill>
@@ -3551,7 +3551,7 @@
                   <pic:spPr>
                     <a:xfrm>
                       <a:off x="0" y="0"/>
-                      <a:ext cx="4140000" cy="3073636"/>
+                      <a:ext cx="4680000" cy="4247421"/>
                     </a:xfrm>
                     <a:prstGeom prst="rect"/>
                   </pic:spPr>
@@ -3585,7 +3585,7 @@
           <w:i w:val="0"/>
           <w:sz w:val="22"/>
         </w:rPr>
-        <w:t>Block diagram. Left: preparing the data once. Right: answering a question. Orange boxes use a language model.</w:t>
+        <w:t>UML component diagram of HF Model Finder: the offline data preparation and the online question answering.</w:t>
       </w:r>
     </w:p>
     <w:p>
@@ -3963,7 +3963,25 @@
           <w:i w:val="0"/>
           <w:sz w:val="22"/>
         </w:rPr>
-        <w:t xml:space="preserve"> shows the steps. (1) </w:t>
+        <w:t xml:space="preserve"> shows the order of messages for one question, and Appendix A (</w:t>
+      </w:r>
+      <w:r>
+        <w:rPr>
+          <w:rFonts w:ascii="Times New Roman" w:hAnsi="Times New Roman" w:cs="Times New Roman" w:eastAsia="Times New Roman"/>
+          <w:b w:val="0"/>
+          <w:i w:val="0"/>
+          <w:sz w:val="22"/>
+        </w:rPr>
+        <w:t>Fig. A.1</w:t>
+      </w:r>
+      <w:r>
+        <w:rPr>
+          <w:rFonts w:ascii="Times New Roman" w:hAnsi="Times New Roman" w:cs="Times New Roman" w:eastAsia="Times New Roman"/>
+          <w:b w:val="0"/>
+          <w:i w:val="0"/>
+          <w:sz w:val="22"/>
+        </w:rPr>
+        <w:t xml:space="preserve">) shows the same steps as an activity diagram. (1) </w:t>
       </w:r>
       <w:r>
         <w:rPr>
@@ -4085,7 +4103,7 @@
       <w:r>
         <w:drawing>
           <wp:inline xmlns:a="http://schemas.openxmlformats.org/drawingml/2006/main" xmlns:pic="http://schemas.openxmlformats.org/drawingml/2006/picture">
-            <wp:extent cx="4320000" cy="2749091"/>
+            <wp:extent cx="4860000" cy="4126308"/>
             <wp:docPr id="3" name="Picture 3"/>
             <wp:cNvGraphicFramePr>
               <a:graphicFrameLocks noChangeAspect="1"/>
@@ -4094,7 +4112,7 @@
               <a:graphicData uri="http://schemas.openxmlformats.org/drawingml/2006/picture">
                 <pic:pic>
                   <pic:nvPicPr>
-                    <pic:cNvPr id="0" name="fig_graph.png"/>
+                    <pic:cNvPr id="0" name="uml_sequence.png"/>
                     <pic:cNvPicPr/>
                   </pic:nvPicPr>
                   <pic:blipFill>
@@ -4106,7 +4124,7 @@
                   <pic:spPr>
                     <a:xfrm>
                       <a:off x="0" y="0"/>
-                      <a:ext cx="4320000" cy="2749091"/>
+                      <a:ext cx="4860000" cy="4126308"/>
                     </a:xfrm>
                     <a:prstGeom prst="rect"/>
                   </pic:spPr>
@@ -4140,7 +4158,7 @@
           <w:i w:val="0"/>
           <w:sz w:val="22"/>
         </w:rPr>
-        <w:t>The question pipeline. Clarify and relax stop a run; the page then calls it again with the user's answer.</w:t>
+        <w:t>UML sequence diagram of one question.</w:t>
       </w:r>
     </w:p>
     <w:p>
@@ -4184,7 +4202,25 @@
           <w:i w:val="0"/>
           <w:sz w:val="22"/>
         </w:rPr>
-        <w:t xml:space="preserve"> is the only place where pass, fail or unknown is decided. A rule can fail only when the data is known and breaks the request, so a shown model can never break a rule the user gave, whatever the search or the language model does.</w:t>
+        <w:t xml:space="preserve"> (and the activity diagram in Appendix A, </w:t>
+      </w:r>
+      <w:r>
+        <w:rPr>
+          <w:rFonts w:ascii="Times New Roman" w:hAnsi="Times New Roman" w:cs="Times New Roman" w:eastAsia="Times New Roman"/>
+          <w:b w:val="0"/>
+          <w:i w:val="0"/>
+          <w:sz w:val="22"/>
+        </w:rPr>
+        <w:t>Fig. A.2</w:t>
+      </w:r>
+      <w:r>
+        <w:rPr>
+          <w:rFonts w:ascii="Times New Roman" w:hAnsi="Times New Roman" w:cs="Times New Roman" w:eastAsia="Times New Roman"/>
+          <w:b w:val="0"/>
+          <w:i w:val="0"/>
+          <w:sz w:val="22"/>
+        </w:rPr>
+        <w:t>) is the only place where pass, fail or unknown is decided. A rule can fail only when the data is known and breaks the request, so a shown model can never break a rule the user gave, whatever the search or the language model does.</w:t>
       </w:r>
     </w:p>
     <w:p>
@@ -8217,7 +8253,88 @@
           <w:b/>
           <w:sz w:val="30"/>
         </w:rPr>
-        <w:t>Appendix A: Flowcharts</w:t>
+        <w:t>Appendix A: UML Activity Diagrams</w:t>
+      </w:r>
+    </w:p>
+    <w:p>
+      <w:pPr>
+        <w:keepNext w:val="0"/>
+        <w:keepLines w:val="0"/>
+        <w:widowControl/>
+        <w:spacing w:line="276" w:lineRule="auto" w:before="0" w:after="100"/>
+        <w:jc w:val="both"/>
+      </w:pPr>
+      <w:r>
+        <w:rPr>
+          <w:rFonts w:ascii="Times New Roman" w:hAnsi="Times New Roman" w:cs="Times New Roman" w:eastAsia="Times New Roman"/>
+          <w:b w:val="0"/>
+          <w:i w:val="0"/>
+          <w:sz w:val="22"/>
+        </w:rPr>
+        <w:t>Fig. A.1</w:t>
+      </w:r>
+      <w:r>
+        <w:rPr>
+          <w:rFonts w:ascii="Times New Roman" w:hAnsi="Times New Roman" w:cs="Times New Roman" w:eastAsia="Times New Roman"/>
+          <w:b w:val="0"/>
+          <w:i w:val="0"/>
+          <w:sz w:val="22"/>
+        </w:rPr>
+        <w:t xml:space="preserve"> shows the whole path of one question. </w:t>
+      </w:r>
+      <w:r>
+        <w:rPr>
+          <w:rFonts w:ascii="Times New Roman" w:hAnsi="Times New Roman" w:cs="Times New Roman" w:eastAsia="Times New Roman"/>
+          <w:b w:val="0"/>
+          <w:i w:val="0"/>
+          <w:sz w:val="22"/>
+        </w:rPr>
+        <w:t>Fig. A.2</w:t>
+      </w:r>
+      <w:r>
+        <w:rPr>
+          <w:rFonts w:ascii="Times New Roman" w:hAnsi="Times New Roman" w:cs="Times New Roman" w:eastAsia="Times New Roman"/>
+          <w:b w:val="0"/>
+          <w:i w:val="0"/>
+          <w:sz w:val="22"/>
+        </w:rPr>
+        <w:t xml:space="preserve"> shows how one model is checked, and </w:t>
+      </w:r>
+      <w:r>
+        <w:rPr>
+          <w:rFonts w:ascii="Times New Roman" w:hAnsi="Times New Roman" w:cs="Times New Roman" w:eastAsia="Times New Roman"/>
+          <w:b w:val="0"/>
+          <w:i w:val="0"/>
+          <w:sz w:val="22"/>
+        </w:rPr>
+        <w:t>Fig. A.3</w:t>
+      </w:r>
+      <w:r>
+        <w:rPr>
+          <w:rFonts w:ascii="Times New Roman" w:hAnsi="Times New Roman" w:cs="Times New Roman" w:eastAsia="Times New Roman"/>
+          <w:b w:val="0"/>
+          <w:i w:val="0"/>
+          <w:sz w:val="22"/>
+        </w:rPr>
+        <w:t xml:space="preserve"> shows the size rule. The diagrams use standard UML activity-diagram notation and were drawn with PlantUML from the text files in </w:t>
+      </w:r>
+      <w:r>
+        <w:rPr>
+          <w:rFonts w:ascii="Courier New" w:hAnsi="Courier New" w:cs="Courier New" w:eastAsia="Courier New"/>
+          <w:b w:val="0"/>
+          <w:i w:val="0"/>
+          <w:sz w:val="20"/>
+        </w:rPr>
+        <w:t>report/source/uml</w:t>
+      </w:r>
+      <w:r>
+        <w:rPr>
+          <w:rFonts w:ascii="Times New Roman" w:hAnsi="Times New Roman" w:cs="Times New Roman" w:eastAsia="Times New Roman"/>
+          <w:b w:val="0"/>
+          <w:i w:val="0"/>
+          <w:sz w:val="22"/>
+        </w:rPr>
+        <w:t>.</w:t>
       </w:r>
     </w:p>
     <w:p>
@@ -8231,7 +8348,7 @@
       <w:r>
         <w:drawing>
           <wp:inline xmlns:a="http://schemas.openxmlformats.org/drawingml/2006/main" xmlns:pic="http://schemas.openxmlformats.org/drawingml/2006/picture">
-            <wp:extent cx="3780000" cy="4009091"/>
+            <wp:extent cx="1908000" cy="7040372"/>
             <wp:docPr id="8" name="Picture 8"/>
             <wp:cNvGraphicFramePr>
               <a:graphicFrameLocks noChangeAspect="1"/>
@@ -8240,7 +8357,7 @@
               <a:graphicData uri="http://schemas.openxmlformats.org/drawingml/2006/picture">
                 <pic:pic>
                   <pic:nvPicPr>
-                    <pic:cNvPr id="0" name="fig_a_verify.png"/>
+                    <pic:cNvPr id="0" name="uml_pipeline.png"/>
                     <pic:cNvPicPr/>
                   </pic:nvPicPr>
                   <pic:blipFill>
@@ -8252,7 +8369,7 @@
                   <pic:spPr>
                     <a:xfrm>
                       <a:off x="0" y="0"/>
-                      <a:ext cx="3780000" cy="4009091"/>
+                      <a:ext cx="1908000" cy="7040372"/>
                     </a:xfrm>
                     <a:prstGeom prst="rect"/>
                   </pic:spPr>
@@ -8286,7 +8403,7 @@
           <w:i w:val="0"/>
           <w:sz w:val="22"/>
         </w:rPr>
-        <w:t>Flowchart of the check for one model: one result for each requested rule, then the combined result.</w:t>
+        <w:t>UML activity diagram of the question pipeline.</w:t>
       </w:r>
     </w:p>
     <w:p>
@@ -8300,7 +8417,7 @@
       <w:r>
         <w:drawing>
           <wp:inline xmlns:a="http://schemas.openxmlformats.org/drawingml/2006/main" xmlns:pic="http://schemas.openxmlformats.org/drawingml/2006/picture">
-            <wp:extent cx="4320000" cy="2618182"/>
+            <wp:extent cx="3960000" cy="4596313"/>
             <wp:docPr id="9" name="Picture 9"/>
             <wp:cNvGraphicFramePr>
               <a:graphicFrameLocks noChangeAspect="1"/>
@@ -8309,7 +8426,7 @@
               <a:graphicData uri="http://schemas.openxmlformats.org/drawingml/2006/picture">
                 <pic:pic>
                   <pic:nvPicPr>
-                    <pic:cNvPr id="0" name="fig_a_size.png"/>
+                    <pic:cNvPr id="0" name="uml_verify.png"/>
                     <pic:cNvPicPr/>
                   </pic:nvPicPr>
                   <pic:blipFill>
@@ -8321,7 +8438,7 @@
                   <pic:spPr>
                     <a:xfrm>
                       <a:off x="0" y="0"/>
-                      <a:ext cx="4320000" cy="2618182"/>
+                      <a:ext cx="3960000" cy="4596313"/>
                     </a:xfrm>
                     <a:prstGeom prst="rect"/>
                   </pic:spPr>
@@ -8355,7 +8472,76 @@
           <w:i w:val="0"/>
           <w:sz w:val="22"/>
         </w:rPr>
-        <w:t>Flowchart of the size rule: the exact total of the main weight files, and unknown if there is any doubt.</w:t>
+        <w:t>UML activity diagram of the check for one model: one result for each requested rule, then the combined result.</w:t>
+      </w:r>
+    </w:p>
+    <w:p>
+      <w:pPr>
+        <w:keepNext/>
+        <w:keepLines w:val="0"/>
+        <w:widowControl/>
+        <w:spacing w:line="240" w:lineRule="auto" w:before="120" w:after="80"/>
+        <w:jc w:val="center"/>
+      </w:pPr>
+      <w:r>
+        <w:drawing>
+          <wp:inline xmlns:a="http://schemas.openxmlformats.org/drawingml/2006/main" xmlns:pic="http://schemas.openxmlformats.org/drawingml/2006/picture">
+            <wp:extent cx="4320000" cy="3234120"/>
+            <wp:docPr id="10" name="Picture 10"/>
+            <wp:cNvGraphicFramePr>
+              <a:graphicFrameLocks noChangeAspect="1"/>
+            </wp:cNvGraphicFramePr>
+            <a:graphic>
+              <a:graphicData uri="http://schemas.openxmlformats.org/drawingml/2006/picture">
+                <pic:pic>
+                  <pic:nvPicPr>
+                    <pic:cNvPr id="0" name="uml_size.png"/>
+                    <pic:cNvPicPr/>
+                  </pic:nvPicPr>
+                  <pic:blipFill>
+                    <a:blip r:embed="rId24"/>
+                    <a:stretch>
+                      <a:fillRect/>
+                    </a:stretch>
+                  </pic:blipFill>
+                  <pic:spPr>
+                    <a:xfrm>
+                      <a:off x="0" y="0"/>
+                      <a:ext cx="4320000" cy="3234120"/>
+                    </a:xfrm>
+                    <a:prstGeom prst="rect"/>
+                  </pic:spPr>
+                </pic:pic>
+              </a:graphicData>
+            </a:graphic>
+          </wp:inline>
+        </w:drawing>
+      </w:r>
+    </w:p>
+    <w:p>
+      <w:pPr>
+        <w:keepNext w:val="0"/>
+        <w:keepLines w:val="0"/>
+        <w:widowControl/>
+        <w:spacing w:line="240" w:lineRule="auto" w:before="40" w:after="240"/>
+        <w:jc w:val="center"/>
+      </w:pPr>
+      <w:r>
+        <w:rPr>
+          <w:rFonts w:ascii="Times New Roman" w:hAnsi="Times New Roman" w:cs="Times New Roman" w:eastAsia="Times New Roman"/>
+          <w:b/>
+          <w:sz w:val="22"/>
+        </w:rPr>
+        <w:t xml:space="preserve">Fig. A.3. </w:t>
+      </w:r>
+      <w:r>
+        <w:rPr>
+          <w:rFonts w:ascii="Times New Roman" w:hAnsi="Times New Roman" w:cs="Times New Roman" w:eastAsia="Times New Roman"/>
+          <w:b w:val="0"/>
+          <w:i w:val="0"/>
+          <w:sz w:val="22"/>
+        </w:rPr>
+        <w:t>UML activity diagram of the size rule: the exact total of the main weight files, unknown if there is any doubt.</w:t>
       </w:r>
     </w:p>
     <w:sectPr>

</xml_diff>